<commit_message>
fix(export): ATX skin fidelity — match delivered reports, not the raw template
The raw template ACE shared renders worse than the studies they deliver: banner logo oversized on the cover, Arial fallback instead of the Calisto MT their PDFs embed, a literal ![LOGO/IMAGE] leak, and honest-fill spam across the cover contact block. Reshape at conversion time to the corpus look: logo becomes a small centered running header on body pages, cover is centered with the parcel aerial (new cover_aerial InlineImage fed from exhibits), cover titles leave the linter's heading outline, unknown cover contact lines render blank, and the linter now catches ![...] placeholders.

Co-authored-by: Cursor <cursoragent@cursor.com>
</commit_message>
<xml_diff>
--- a/assets/templates/atxcivil_v1.docx
+++ b/assets/templates/atxcivil_v1.docx
@@ -4,11 +4,12 @@
   <w:body>
     <w:p>
       <w:pPr>
-        <w:pStyle w:val="Heading1"/>
+        <w:pStyle w:val="Title"/>
         <w:keepNext w:val="0"/>
         <w:keepLines w:val="0"/>
         <w:spacing w:before="480" w:lineRule="auto"/>
         <w:ind w:left="-360" w:firstLine="0"/>
+        <w:jc w:val="center"/>
         <w:rPr>
           <w:b w:val="1"/>
           <w:i w:val="1"/>
@@ -16,76 +17,14 @@
           <w:szCs w:val="46"/>
         </w:rPr>
       </w:pPr>
-      <w:bookmarkStart w:colFirst="0" w:colLast="0" w:name="_lil0eukfmcda" w:id="0"/>
-      <w:bookmarkEnd w:id="0"/>
+      <w:bookmarkStart w:colFirst="0" w:colLast="0" w:name="_vxk8vxtv69jp" w:id="1"/>
+      <w:bookmarkEnd w:id="1"/>
       <w:r>
         <w:rPr>
           <w:b w:val="1"/>
           <w:i w:val="1"/>
           <w:sz w:val="46"/>
           <w:szCs w:val="46"/>
-        </w:rPr>
-        <w:drawing>
-          <wp:inline distB="114300" distT="114300" distL="114300" distR="114300">
-            <wp:extent cx="5943600" cy="1295400"/>
-            <wp:effectExtent b="0" l="0" r="0" t="0"/>
-            <wp:docPr id="1" name="image1.png"/>
-            <a:graphic>
-              <a:graphicData uri="http://schemas.openxmlformats.org/drawingml/2006/picture">
-                <pic:pic>
-                  <pic:nvPicPr>
-                    <pic:cNvPr id="0" name="image1.png"/>
-                    <pic:cNvPicPr preferRelativeResize="0"/>
-                  </pic:nvPicPr>
-                  <pic:blipFill>
-                    <a:blip r:embed="rId6"/>
-                    <a:srcRect b="0" l="0" r="0" t="0"/>
-                    <a:stretch>
-                      <a:fillRect/>
-                    </a:stretch>
-                  </pic:blipFill>
-                  <pic:spPr>
-                    <a:xfrm>
-                      <a:off x="0" y="0"/>
-                      <a:ext cx="5943600" cy="1295400"/>
-                    </a:xfrm>
-                    <a:prstGeom prst="rect"/>
-                    <a:ln/>
-                  </pic:spPr>
-                </pic:pic>
-              </a:graphicData>
-            </a:graphic>
-          </wp:inline>
-        </w:drawing>
-      </w:r>
-      <w:r>
-        <w:rPr>
-          <w:rtl w:val="0"/>
-        </w:rPr>
-      </w:r>
-    </w:p>
-    <w:p>
-      <w:pPr>
-        <w:pStyle w:val="Heading1"/>
-        <w:keepNext w:val="0"/>
-        <w:keepLines w:val="0"/>
-        <w:spacing w:before="480" w:lineRule="auto"/>
-        <w:ind w:left="-360" w:firstLine="0"/>
-        <w:rPr>
-          <w:b w:val="1"/>
-          <w:i w:val="1"/>
-          <w:sz w:val="46"/>
-          <w:szCs w:val="46"/>
-        </w:rPr>
-      </w:pPr>
-      <w:bookmarkStart w:colFirst="0" w:colLast="0" w:name="_vxk8vxtv69jp" w:id="1"/>
-      <w:bookmarkEnd w:id="1"/>
-      <w:r>
-        <w:rPr>
-          <w:b w:val="1"/>
-          <w:i w:val="1"/>
-          <w:sz w:val="46"/>
-          <w:szCs w:val="46"/>
           <w:rtl w:val="0"/>
         </w:rPr>
         <w:t>{{ project_name }}</w:t>
@@ -94,6 +33,7 @@
     <w:p>
       <w:pPr>
         <w:spacing w:after="240" w:before="240" w:lineRule="auto"/>
+        <w:jc w:val="center"/>
         <w:rPr/>
       </w:pPr>
       <w:r>
@@ -106,6 +46,7 @@
     <w:p>
       <w:pPr>
         <w:spacing w:after="240" w:before="240" w:lineRule="auto"/>
+        <w:jc w:val="center"/>
         <w:rPr/>
       </w:pPr>
       <w:r>
@@ -126,18 +67,20 @@
     <w:p>
       <w:pPr>
         <w:spacing w:after="240" w:before="240" w:lineRule="auto"/>
-        <w:rPr/>
-      </w:pPr>
-      <w:r>
-        <w:rPr>
-          <w:rtl w:val="0"/>
-        </w:rPr>
-        <w:t xml:space="preserve">![LOGO/IMAGE]</w:t>
-      </w:r>
-    </w:p>
-    <w:p>
-      <w:pPr>
-        <w:spacing w:after="240" w:before="240" w:lineRule="auto"/>
+        <w:jc w:val="center"/>
+        <w:rPr/>
+      </w:pPr>
+      <w:r>
+        <w:rPr>
+          <w:rtl w:val="0"/>
+        </w:rPr>
+        <w:t>{{ cover_aerial }}</w:t>
+      </w:r>
+    </w:p>
+    <w:p>
+      <w:pPr>
+        <w:spacing w:after="240" w:before="240" w:lineRule="auto"/>
+        <w:jc w:val="center"/>
         <w:rPr>
           <w:i w:val="1"/>
         </w:rPr>
@@ -153,6 +96,7 @@
     <w:p>
       <w:pPr>
         <w:spacing w:after="240" w:before="240" w:lineRule="auto"/>
+        <w:jc w:val="center"/>
         <w:rPr>
           <w:i w:val="1"/>
         </w:rPr>
@@ -168,6 +112,7 @@
     <w:p>
       <w:pPr>
         <w:spacing w:after="240" w:before="240" w:lineRule="auto"/>
+        <w:jc w:val="center"/>
         <w:rPr>
           <w:b w:val="1"/>
           <w:sz w:val="34"/>
@@ -197,14 +142,18 @@
           <w:rtl w:val="0"/>
         </w:rPr>
       </w:r>
-    </w:p>
-    <w:p>
-      <w:pPr>
-        <w:pStyle w:val="Heading1"/>
+      <w:r>
+        <w:br w:type="page"/>
+      </w:r>
+    </w:p>
+    <w:p>
+      <w:pPr>
+        <w:pStyle w:val="Title"/>
         <w:keepNext w:val="0"/>
         <w:keepLines w:val="0"/>
         <w:spacing w:before="480" w:lineRule="auto"/>
         <w:ind w:left="-405" w:firstLine="0"/>
+        <w:jc w:val="center"/>
         <w:rPr>
           <w:b w:val="1"/>
           <w:sz w:val="46"/>
@@ -225,7 +174,7 @@
     </w:p>
     <w:p>
       <w:pPr>
-        <w:pStyle w:val="Heading1"/>
+        <w:pStyle w:val="Title"/>
         <w:keepNext w:val="0"/>
         <w:keepLines w:val="0"/>
         <w:spacing w:before="480" w:lineRule="auto"/>
@@ -2636,12 +2585,59 @@
       </w:r>
     </w:p>
     <w:sectPr>
+      <w:headerReference w:type="default" r:id="rId7"/>
       <w:pgSz w:h="15840" w:w="12240" w:orient="portrait"/>
       <w:pgMar w:bottom="1440" w:top="1440" w:left="1440" w:right="1440" w:header="720" w:footer="720"/>
       <w:pgNumType w:start="1"/>
+      <w:titlePg/>
     </w:sectPr>
   </w:body>
 </w:document>
+</file>
+
+<file path=word/header1.xml><?xml version="1.0" encoding="utf-8"?>
+<w:hdr xmlns:m="http://schemas.openxmlformats.org/officeDocument/2006/math" xmlns:mc="http://schemas.openxmlformats.org/markup-compatibility/2006" xmlns:mo="http://schemas.microsoft.com/office/mac/office/2008/main" xmlns:mv="urn:schemas-microsoft-com:mac:vml" xmlns:o="urn:schemas-microsoft-com:office:office" xmlns:r="http://schemas.openxmlformats.org/officeDocument/2006/relationships" xmlns:v="urn:schemas-microsoft-com:vml" xmlns:w10="urn:schemas-microsoft-com:office:word" xmlns:w14="http://schemas.microsoft.com/office/word/2010/wordml" xmlns:w="http://schemas.openxmlformats.org/wordprocessingml/2006/main" xmlns:wne="http://schemas.microsoft.com/office/word/2006/wordml" xmlns:wp14="http://schemas.microsoft.com/office/word/2010/wordprocessingDrawing" xmlns:wp="http://schemas.openxmlformats.org/drawingml/2006/wordprocessingDrawing" xmlns:wpc="http://schemas.microsoft.com/office/word/2010/wordprocessingCanvas" xmlns:wpg="http://schemas.microsoft.com/office/word/2010/wordprocessingGroup" xmlns:wpi="http://schemas.microsoft.com/office/word/2010/wordprocessingInk" xmlns:wps="http://schemas.microsoft.com/office/word/2010/wordprocessingShape" mc:Ignorable="w14 wp14">
+  <w:p>
+    <w:pPr>
+      <w:pStyle w:val="Header"/>
+      <w:jc w:val="center"/>
+    </w:pPr>
+    <w:r>
+      <w:drawing>
+        <wp:inline xmlns:a="http://schemas.openxmlformats.org/drawingml/2006/main" xmlns:pic="http://schemas.openxmlformats.org/drawingml/2006/picture">
+          <wp:extent cx="1828800" cy="400304"/>
+          <wp:docPr id="1" name="Picture 1"/>
+          <wp:cNvGraphicFramePr>
+            <a:graphicFrameLocks noChangeAspect="1"/>
+          </wp:cNvGraphicFramePr>
+          <a:graphic>
+            <a:graphicData uri="http://schemas.openxmlformats.org/drawingml/2006/picture">
+              <pic:pic>
+                <pic:nvPicPr>
+                  <pic:cNvPr id="0" name="image.png"/>
+                  <pic:cNvPicPr/>
+                </pic:nvPicPr>
+                <pic:blipFill>
+                  <a:blip r:embed="rId1"/>
+                  <a:stretch>
+                    <a:fillRect/>
+                  </a:stretch>
+                </pic:blipFill>
+                <pic:spPr>
+                  <a:xfrm>
+                    <a:off x="0" y="0"/>
+                    <a:ext cx="1828800" cy="400304"/>
+                  </a:xfrm>
+                  <a:prstGeom prst="rect"/>
+                </pic:spPr>
+              </pic:pic>
+            </a:graphicData>
+          </a:graphic>
+        </wp:inline>
+      </w:drawing>
+    </w:r>
+  </w:p>
+</w:hdr>
 </file>
 
 <file path=word/numbering.xml><?xml version="1.0" encoding="utf-8"?>
@@ -3120,6 +3116,9 @@
   </w:docDefaults>
   <w:style w:type="paragraph" w:styleId="Normal" w:default="1">
     <w:name w:val="normal"/>
+    <w:rPr>
+      <w:rFonts w:ascii="Calisto MT" w:hAnsi="Calisto MT" w:cs="Calisto MT" w:eastAsia="Calisto MT"/>
+    </w:rPr>
   </w:style>
   <w:style w:type="table" w:styleId="TableNormal" w:default="1">
     <w:name w:val="TableNormal"/>
@@ -3135,6 +3134,7 @@
       <w:spacing w:after="120" w:before="400" w:lineRule="auto"/>
     </w:pPr>
     <w:rPr>
+      <w:rFonts w:ascii="Calisto MT" w:hAnsi="Calisto MT" w:cs="Calisto MT" w:eastAsia="Calisto MT"/>
       <w:sz w:val="40"/>
       <w:szCs w:val="40"/>
     </w:rPr>
@@ -3150,6 +3150,7 @@
       <w:ind w:left="-90" w:hanging="360"/>
     </w:pPr>
     <w:rPr>
+      <w:rFonts w:ascii="Calisto MT" w:hAnsi="Calisto MT" w:cs="Calisto MT" w:eastAsia="Calisto MT"/>
       <w:b w:val="1"/>
       <w:sz w:val="34"/>
       <w:szCs w:val="34"/>
@@ -3166,6 +3167,7 @@
       <w:spacing w:after="80" w:before="320" w:lineRule="auto"/>
     </w:pPr>
     <w:rPr>
+      <w:rFonts w:ascii="Calisto MT" w:hAnsi="Calisto MT" w:cs="Calisto MT" w:eastAsia="Calisto MT"/>
       <w:b w:val="0"/>
       <w:color w:val="434343"/>
       <w:sz w:val="28"/>
@@ -3232,6 +3234,7 @@
       <w:spacing w:after="60" w:before="0" w:lineRule="auto"/>
     </w:pPr>
     <w:rPr>
+      <w:rFonts w:ascii="Calisto MT" w:hAnsi="Calisto MT" w:cs="Calisto MT" w:eastAsia="Calisto MT"/>
       <w:sz w:val="52"/>
       <w:szCs w:val="52"/>
     </w:rPr>

</xml_diff>

<commit_message>
fix(export): TipTap paragraph breaks, mega-blob reflow, and Calisto house fonts
Adjacent editor <p> tags become real Word paragraphs; long single-p walls reflow at sentence boundaries; Subdoc runs pin to Calisto MT / Source Sans 3; ATX template docDefaults+Subtitle no longer fall back to Arial.
</commit_message>
<xml_diff>
--- a/assets/templates/atxcivil_v1.docx
+++ b/assets/templates/atxcivil_v1.docx
@@ -3102,7 +3102,7 @@
   <w:docDefaults>
     <w:rPrDefault>
       <w:rPr>
-        <w:rFonts w:ascii="Arial" w:cs="Arial" w:eastAsia="Arial" w:hAnsi="Arial"/>
+        <w:rFonts w:ascii="Calisto MT" w:cs="Calisto MT" w:eastAsia="Calisto MT" w:hAnsi="Calisto MT"/>
         <w:sz w:val="22"/>
         <w:szCs w:val="22"/>
         <w:lang w:val="en"/>
@@ -3250,7 +3250,7 @@
       <w:spacing w:after="320" w:before="0" w:lineRule="auto"/>
     </w:pPr>
     <w:rPr>
-      <w:rFonts w:ascii="Arial" w:cs="Arial" w:eastAsia="Arial" w:hAnsi="Arial"/>
+      <w:rFonts w:ascii="Calisto MT" w:cs="Calisto MT" w:eastAsia="Calisto MT" w:hAnsi="Calisto MT"/>
       <w:i w:val="0"/>
       <w:color w:val="666666"/>
       <w:sz w:val="30"/>

</xml_diff>

<commit_message>
fix(export): TipTap paragraph breaks, mega-blob reflow, and Calisto house fonts (#73)
Adjacent editor <p> tags become real Word paragraphs; long single-p walls reflow at sentence boundaries; Subdoc runs pin to Calisto MT / Source Sans 3; ATX template docDefaults+Subtitle no longer fall back to Arial.
</commit_message>
<xml_diff>
--- a/assets/templates/atxcivil_v1.docx
+++ b/assets/templates/atxcivil_v1.docx
@@ -3102,7 +3102,7 @@
   <w:docDefaults>
     <w:rPrDefault>
       <w:rPr>
-        <w:rFonts w:ascii="Arial" w:cs="Arial" w:eastAsia="Arial" w:hAnsi="Arial"/>
+        <w:rFonts w:ascii="Calisto MT" w:cs="Calisto MT" w:eastAsia="Calisto MT" w:hAnsi="Calisto MT"/>
         <w:sz w:val="22"/>
         <w:szCs w:val="22"/>
         <w:lang w:val="en"/>
@@ -3250,7 +3250,7 @@
       <w:spacing w:after="320" w:before="0" w:lineRule="auto"/>
     </w:pPr>
     <w:rPr>
-      <w:rFonts w:ascii="Arial" w:cs="Arial" w:eastAsia="Arial" w:hAnsi="Arial"/>
+      <w:rFonts w:ascii="Calisto MT" w:cs="Calisto MT" w:eastAsia="Calisto MT" w:hAnsi="Calisto MT"/>
       <w:i w:val="0"/>
       <w:color w:val="666666"/>
       <w:sz w:val="30"/>

</xml_diff>

<commit_message>
fix(export): TipTap paragraph breaks, mega-blob reflow, and Calisto house fonts (#73) (#74)
Adjacent editor <p> tags become real Word paragraphs; long single-p walls reflow at sentence boundaries; Subdoc runs pin to Calisto MT / Source Sans 3; ATX template docDefaults+Subtitle no longer fall back to Arial.
</commit_message>
<xml_diff>
--- a/assets/templates/atxcivil_v1.docx
+++ b/assets/templates/atxcivil_v1.docx
@@ -3102,7 +3102,7 @@
   <w:docDefaults>
     <w:rPrDefault>
       <w:rPr>
-        <w:rFonts w:ascii="Arial" w:cs="Arial" w:eastAsia="Arial" w:hAnsi="Arial"/>
+        <w:rFonts w:ascii="Calisto MT" w:cs="Calisto MT" w:eastAsia="Calisto MT" w:hAnsi="Calisto MT"/>
         <w:sz w:val="22"/>
         <w:szCs w:val="22"/>
         <w:lang w:val="en"/>
@@ -3250,7 +3250,7 @@
       <w:spacing w:after="320" w:before="0" w:lineRule="auto"/>
     </w:pPr>
     <w:rPr>
-      <w:rFonts w:ascii="Arial" w:cs="Arial" w:eastAsia="Arial" w:hAnsi="Arial"/>
+      <w:rFonts w:ascii="Calisto MT" w:cs="Calisto MT" w:eastAsia="Calisto MT" w:hAnsi="Calisto MT"/>
       <w:i w:val="0"/>
       <w:color w:val="666666"/>
       <w:sz w:val="30"/>

</xml_diff>

<commit_message>
fix(export): polish ATX skin defects from Trappers PDF review
Wire the identification table, drop invented See-Exhibit boilerplate,
strip markdown bold leaks, remove truncated hydrology stems and empty
numbered EXHIBITS rows, and scrub site address mashed into permit contacts.
</commit_message>
<xml_diff>
--- a/assets/templates/atxcivil_v1.docx
+++ b/assets/templates/atxcivil_v1.docx
@@ -332,19 +332,18 @@
         <w:rPr>
           <w:rtl w:val="0"/>
         </w:rPr>
-        <w:t xml:space="preserve">The property was {{ jurisdiction_status }}. {{ jurisdiction_info }}. </w:t>
-      </w:r>
-    </w:p>
-    <w:p>
-      <w:pPr>
-        <w:spacing w:after="240" w:before="240" w:lineRule="auto"/>
-        <w:rPr/>
-      </w:pPr>
-      <w:r>
-        <w:rPr>
-          <w:rtl w:val="0"/>
-        </w:rPr>
-        <w:t xml:space="preserve">(See Exhibits: Vicinity Map, Zoning Map, Land Status Determination and ETJ Zone Release Letter).</w:t>
+        <w:t>The property is located in {{ jurisdiction_status }}.</w:t>
+      </w:r>
+    </w:p>
+    <w:p>
+      <w:pPr>
+        <w:spacing w:after="240" w:before="240" w:lineRule="auto"/>
+        <w:rPr/>
+      </w:pPr>
+      <w:r>
+        <w:rPr>
+          <w:rtl w:val="0"/>
+        </w:rPr>
       </w:r>
     </w:p>
     <w:tbl>
@@ -603,6 +602,7 @@
               <w:rPr>
                 <w:rtl w:val="0"/>
               </w:rPr>
+              <w:t>{{ tract }}</w:t>
             </w:r>
           </w:p>
         </w:tc>
@@ -632,6 +632,7 @@
               <w:rPr>
                 <w:rtl w:val="0"/>
               </w:rPr>
+              <w:t>{{ parcel_id }}</w:t>
             </w:r>
           </w:p>
         </w:tc>
@@ -661,6 +662,7 @@
               <w:rPr>
                 <w:rtl w:val="0"/>
               </w:rPr>
+              <w:t>{{ property_address }}</w:t>
             </w:r>
           </w:p>
         </w:tc>
@@ -690,6 +692,7 @@
               <w:rPr>
                 <w:rtl w:val="0"/>
               </w:rPr>
+              <w:t>{{ deed_doc_no }}</w:t>
             </w:r>
           </w:p>
         </w:tc>
@@ -719,6 +722,7 @@
               <w:rPr>
                 <w:rtl w:val="0"/>
               </w:rPr>
+              <w:t>{{ property_acres }}</w:t>
             </w:r>
           </w:p>
         </w:tc>
@@ -733,19 +737,19 @@
         <w:rPr>
           <w:rtl w:val="0"/>
         </w:rPr>
-        <w:t>The lot is currently developed and consists of {{ existing_development }}. (See Survey)</w:t>
-      </w:r>
-    </w:p>
-    <w:p>
-      <w:pPr>
-        <w:spacing w:after="240" w:before="240" w:lineRule="auto"/>
-        <w:rPr/>
-      </w:pPr>
-      <w:r>
-        <w:rPr>
-          <w:rtl w:val="0"/>
-        </w:rPr>
-        <w:t>The proposed land development consists of {{ proposed_development }}. (See Proposed Development Plan)</w:t>
+        <w:t>The lot is currently developed and consists of {{ existing_development }}.</w:t>
+      </w:r>
+    </w:p>
+    <w:p>
+      <w:pPr>
+        <w:spacing w:after="240" w:before="240" w:lineRule="auto"/>
+        <w:rPr/>
+      </w:pPr>
+      <w:r>
+        <w:rPr>
+          <w:rtl w:val="0"/>
+        </w:rPr>
+        <w:t>The proposed land development consists of {{ proposed_development }}.</w:t>
       </w:r>
     </w:p>
     <w:p>
@@ -796,43 +800,43 @@
         <w:rPr>
           <w:rtl w:val="0"/>
         </w:rPr>
-        <w:t>This lot is located within the boundaries of the {{ ecoregion }} ecoregion zone, which is {{ ecoregion_desc }}. (See the {{ ecoregion }} Map)</w:t>
-      </w:r>
-    </w:p>
-    <w:p>
-      <w:pPr>
-        <w:spacing w:after="240" w:before="240" w:lineRule="auto"/>
-        <w:rPr/>
-      </w:pPr>
-      <w:r>
-        <w:rPr>
-          <w:rtl w:val="0"/>
-        </w:rPr>
-        <w:t>According to the maps and additional data the property {{ hydrology_char }}. (See the Hydrology Characteristics Map).</w:t>
-      </w:r>
-    </w:p>
-    <w:p>
-      <w:pPr>
-        <w:spacing w:after="240" w:before="240" w:lineRule="auto"/>
-        <w:rPr/>
-      </w:pPr>
-      <w:r>
-        <w:rPr>
-          <w:rtl w:val="0"/>
-        </w:rPr>
-        <w:t>The existing elevation ranges from {{ min_elevation }} ft to {{ max_elevation }} ft, with slopes that range from {{ min_slope }}% to +/- {{ max_slope }}%. (See Exhibits: Slope Map).</w:t>
-      </w:r>
-    </w:p>
-    <w:p>
-      <w:pPr>
-        <w:spacing w:after="240" w:before="240" w:lineRule="auto"/>
-        <w:rPr/>
-      </w:pPr>
-      <w:r>
-        <w:rPr>
-          <w:rtl w:val="0"/>
-        </w:rPr>
-        <w:t>The attached United States Geological Survey shows the site to be mostly comprised of {{ soil_types }}. (See Exhibits: Soil Map &amp; Engineering Properties Table)</w:t>
+        <w:t>This lot is located within the boundaries of the {{ ecoregion }} ecoregion zone, which is {{ ecoregion_desc }}.</w:t>
+      </w:r>
+    </w:p>
+    <w:p>
+      <w:pPr>
+        <w:spacing w:after="240" w:before="240" w:lineRule="auto"/>
+        <w:rPr/>
+      </w:pPr>
+      <w:r>
+        <w:rPr>
+          <w:rtl w:val="0"/>
+        </w:rPr>
+        <w:t>{{ hydrology_char }}</w:t>
+      </w:r>
+    </w:p>
+    <w:p>
+      <w:pPr>
+        <w:spacing w:after="240" w:before="240" w:lineRule="auto"/>
+        <w:rPr/>
+      </w:pPr>
+      <w:r>
+        <w:rPr>
+          <w:rtl w:val="0"/>
+        </w:rPr>
+        <w:t>The existing elevation ranges from {{ min_elevation }} ft to {{ max_elevation }} ft, with slopes that range from {{ min_slope }}% to +/- {{ max_slope }}%.</w:t>
+      </w:r>
+    </w:p>
+    <w:p>
+      <w:pPr>
+        <w:spacing w:after="240" w:before="240" w:lineRule="auto"/>
+        <w:rPr/>
+      </w:pPr>
+      <w:r>
+        <w:rPr>
+          <w:rtl w:val="0"/>
+        </w:rPr>
+        <w:t>The attached United States Geological Survey shows the site to be mostly comprised of {{ soil_types }}.</w:t>
       </w:r>
     </w:p>
     <w:p>
@@ -2478,10 +2482,6 @@
     </w:p>
     <w:p>
       <w:pPr>
-        <w:numPr>
-          <w:ilvl w:val="0"/>
-          <w:numId w:val="1"/>
-        </w:numPr>
         <w:spacing w:after="0" w:afterAutospacing="0" w:before="240" w:lineRule="auto"/>
         <w:ind w:left="720" w:hanging="360"/>
       </w:pPr>
@@ -2489,15 +2489,21 @@
         <w:rPr>
           <w:rtl w:val="0"/>
         </w:rPr>
+        <w:t>{%p if exhibit_1 %}</w:t>
+      </w:r>
+    </w:p>
+    <w:p>
+      <w:r>
         <w:t>{{ exhibit_1 }}</w:t>
       </w:r>
     </w:p>
     <w:p>
-      <w:pPr>
-        <w:numPr>
-          <w:ilvl w:val="0"/>
-          <w:numId w:val="1"/>
-        </w:numPr>
+      <w:r>
+        <w:t>{%p endif %}</w:t>
+      </w:r>
+    </w:p>
+    <w:p>
+      <w:pPr>
         <w:spacing w:after="0" w:afterAutospacing="0" w:before="0" w:beforeAutospacing="0" w:lineRule="auto"/>
         <w:ind w:left="720" w:hanging="360"/>
       </w:pPr>
@@ -2505,15 +2511,21 @@
         <w:rPr>
           <w:rtl w:val="0"/>
         </w:rPr>
+        <w:t>{%p if exhibit_2 %}</w:t>
+      </w:r>
+    </w:p>
+    <w:p>
+      <w:r>
         <w:t>{{ exhibit_2 }}</w:t>
       </w:r>
     </w:p>
     <w:p>
-      <w:pPr>
-        <w:numPr>
-          <w:ilvl w:val="0"/>
-          <w:numId w:val="1"/>
-        </w:numPr>
+      <w:r>
+        <w:t>{%p endif %}</w:t>
+      </w:r>
+    </w:p>
+    <w:p>
+      <w:pPr>
         <w:spacing w:after="0" w:afterAutospacing="0" w:before="0" w:beforeAutospacing="0" w:lineRule="auto"/>
         <w:ind w:left="720" w:hanging="360"/>
       </w:pPr>
@@ -2521,15 +2533,21 @@
         <w:rPr>
           <w:rtl w:val="0"/>
         </w:rPr>
+        <w:t>{%p if exhibit_3 %}</w:t>
+      </w:r>
+    </w:p>
+    <w:p>
+      <w:r>
         <w:t>{{ exhibit_3 }}</w:t>
       </w:r>
     </w:p>
     <w:p>
-      <w:pPr>
-        <w:numPr>
-          <w:ilvl w:val="0"/>
-          <w:numId w:val="1"/>
-        </w:numPr>
+      <w:r>
+        <w:t>{%p endif %}</w:t>
+      </w:r>
+    </w:p>
+    <w:p>
+      <w:pPr>
         <w:spacing w:after="0" w:afterAutospacing="0" w:before="0" w:beforeAutospacing="0" w:lineRule="auto"/>
         <w:ind w:left="720" w:hanging="360"/>
       </w:pPr>
@@ -2537,15 +2555,21 @@
         <w:rPr>
           <w:rtl w:val="0"/>
         </w:rPr>
+        <w:t>{%p if exhibit_4 %}</w:t>
+      </w:r>
+    </w:p>
+    <w:p>
+      <w:r>
         <w:t>{{ exhibit_4 }}</w:t>
       </w:r>
     </w:p>
     <w:p>
-      <w:pPr>
-        <w:numPr>
-          <w:ilvl w:val="0"/>
-          <w:numId w:val="1"/>
-        </w:numPr>
+      <w:r>
+        <w:t>{%p endif %}</w:t>
+      </w:r>
+    </w:p>
+    <w:p>
+      <w:pPr>
         <w:spacing w:after="0" w:afterAutospacing="0" w:before="0" w:beforeAutospacing="0" w:lineRule="auto"/>
         <w:ind w:left="720" w:hanging="360"/>
       </w:pPr>
@@ -2553,7 +2577,17 @@
         <w:rPr>
           <w:rtl w:val="0"/>
         </w:rPr>
+        <w:t>{%p if exhibit_5 %}</w:t>
+      </w:r>
+    </w:p>
+    <w:p>
+      <w:r>
         <w:t>{{ exhibit_5 }}</w:t>
+      </w:r>
+    </w:p>
+    <w:p>
+      <w:r>
+        <w:t>{%p endif %}</w:t>
       </w:r>
     </w:p>
     <w:p>

</xml_diff>

<commit_message>
feat(export): state Class A absence in Purpose & Scope (#514)
Study limitations must disclose that no served fact is a legal instrument —
regulatory conclusions are dataset renderings of regulatory text.
</commit_message>
<xml_diff>
--- a/assets/templates/atxcivil_v1.docx
+++ b/assets/templates/atxcivil_v1.docx
@@ -233,6 +233,16 @@
           <w:rtl w:val="0"/>
         </w:rPr>
         <w:t xml:space="preserve">This report is intended to provide preliminary engineering data for the Owner to outline the development requirements for a proposed site plan. The scope consists of research information for site development, permitting agencies and jurisdictions. The following information is a summary of the research into this property.</w:t>
+      </w:r>
+    </w:p>
+    <w:p>
+      <w:pPr>
+        <w:spacing w:after="240" w:before="240" w:lineRule="auto"/>
+        <w:rPr/>
+      </w:pPr>
+      <w:r/>
+      <w:r>
+        <w:t>Limitation — confidence Class A (legal instruments): this report does not serve ordinances, plats, deeds, permits, or other controlling instruments as facts. Every regulatory conclusion here is a dataset rendering of regulatory text, not the instrument itself. Confirm controlling documents with the issuing authority before design or entitlement filings.</w:t>
       </w:r>
     </w:p>
     <w:p>

</xml_diff>